<commit_message>
docs: unify internal titles and naming to DevManager
- v1: cover title "DevManager 설계안 v1"; "AI Dev Manager" -> "DevManager"
  in body and footer
- v2: cover "DevManager 설계안 v2"; fix "AI Dev Manager" / "AIDevManager"
  in the architecture diagram, migration flow, and final recommendation

Co-Authored-By: Claude Sonnet 5 <noreply@anthropic.com>
</commit_message>
<xml_diff>
--- a/docs/DevManager-Design-v1.docx
+++ b/docs/DevManager-Design-v1.docx
@@ -14,7 +14,7 @@
           <w:color w:val="1F4E79"/>
           <w:sz w:val="50"/>
         </w:rPr>
-        <w:t>AI 개발환경 관리자 설계안</w:t>
+        <w:t>DevManager 설계안 v1</w:t>
       </w:r>
     </w:p>
     <w:p>
@@ -129,7 +129,7 @@
           <w:rFonts w:ascii="NanumSquare" w:hAnsi="NanumSquare" w:eastAsia="NanumSquare"/>
           <w:sz w:val="21"/>
         </w:rPr>
-        <w:t>본 설계는 특정 프로젝트 하나(maple-app 등)에 종속되지 않는 범용 AI 개발환경 관리 시스템을 목표로 한다. 사용자는 C/C++ 또는 Next.js 프로젝트를 주로 수행하며, Claude Code와 Codex를 함께 사용한다. Headroom과 OmniRoute 같은 로컬 AI 인프라는 Windows Host에 공용으로 유지하고, 프로젝트별 개발도구와 AI 작업 상태는 Docker 컨테이너/Volume으로 격리한다.</w:t>
+        <w:t>본 설계는 특정 프로젝트 하나(maple-app 등)에 종속되지 않는 범용 AI 개발환경 관리 시스템 DevManager을 목표로 한다. 사용자는 C/C++ 또는 Next.js 프로젝트를 주로 수행하며, Claude Code와 Codex를 함께 사용한다. Headroom과 OmniRoute 같은 로컬 AI 인프라는 Windows Host에 공용으로 유지하고, 프로젝트별 개발도구와 AI 작업 상태는 Docker 컨테이너/Volume으로 격리한다.</w:t>
       </w:r>
     </w:p>
     <w:p>
@@ -152,7 +152,7 @@
           <w:rFonts w:ascii="Noto Sans Mono CJK KR" w:hAnsi="Noto Sans Mono CJK KR" w:eastAsia="Noto Sans Mono CJK KR"/>
           <w:sz w:val="17"/>
         </w:rPr>
-        <w:t>├─ Qt6 AI Dev Manager</w:t>
+        <w:t>├─ Qt6 DevManager</w:t>
       </w:r>
       <w:r>
         <w:br/>
@@ -865,7 +865,7 @@
           <w:rFonts w:ascii="Noto Sans Mono CJK KR" w:hAnsi="Noto Sans Mono CJK KR" w:eastAsia="Noto Sans Mono CJK KR"/>
           <w:sz w:val="17"/>
         </w:rPr>
-        <w:t>│  AI Dev Manager.exe (Qt6)                                    │</w:t>
+        <w:t>│  DevManager.exe (Qt6)                                    │</w:t>
       </w:r>
       <w:r>
         <w:br/>
@@ -3491,7 +3491,7 @@
           <w:rFonts w:ascii="Noto Sans Mono CJK KR" w:hAnsi="Noto Sans Mono CJK KR" w:eastAsia="Noto Sans Mono CJK KR"/>
           <w:sz w:val="17"/>
         </w:rPr>
-        <w:t>AI Dev Manager 설치</w:t>
+        <w:t>DevManager 설치</w:t>
       </w:r>
       <w:r>
         <w:br/>
@@ -5254,7 +5254,7 @@
                 <w:rFonts w:ascii="NanumSquare" w:hAnsi="NanumSquare" w:eastAsia="NanumSquare"/>
                 <w:sz w:val="17"/>
               </w:rPr>
-              <w:t>AIDevManager.exe 설치 후 초기 Bootstrap 가능</w:t>
+              <w:t>DevManager.exe 설치 후 초기 Bootstrap 가능</w:t>
             </w:r>
           </w:p>
         </w:tc>
@@ -5653,7 +5653,7 @@
                 <w:rFonts w:ascii="NanumSquare" w:hAnsi="NanumSquare" w:eastAsia="NanumSquare"/>
                 <w:sz w:val="19"/>
               </w:rPr>
-              <w:t>새 PC에서는 AIDevManager 설치 후 Host Bootstrap 한 번, 새 프로젝트에서는 GUI에서 “C++” 또는 “Next.js”를 선택하고 생성 버튼 한 번으로 독립 AI 개발환경이 준비되는 수준을 목표로 한다.</w:t>
+              <w:t>새 PC에서는 DevManager 설치 후 Host Bootstrap 한 번, 새 프로젝트에서는 GUI에서 “C++” 또는 “Next.js”를 선택하고 생성 버튼 한 번으로 독립 AI 개발환경이 준비되는 수준을 목표로 한다.</w:t>
             </w:r>
           </w:p>
         </w:tc>
@@ -5684,7 +5684,7 @@
         <w:color w:val="787878"/>
         <w:sz w:val="16"/>
       </w:rPr>
-      <w:t>AI Dev Environment Design  |  C++/Qt6 + Docker</w:t>
+      <w:t>DevManager Design v1  |  C++/Qt6 + Docker</w:t>
     </w:r>
   </w:p>
 </w:ftr>

</xml_diff>